<commit_message>
Adiciona interface gráfica, amplia sistema bancário e corrige relatórios acadêmicos
</commit_message>
<xml_diff>
--- a/documentacao/RELATORIO_CONSOLIDADO.docx
+++ b/documentacao/RELATORIO_CONSOLIDADO.docx
@@ -21,9 +21,9 @@
         <w:br/>
         <w:t>Aluno: Igor Fillipe Brandão Machado</w:t>
         <w:br/>
-        <w:t>Professor: Igor Fillipe Brandão Machado</w:t>
+        <w:t>Professor: George Mendes Marra</w:t>
         <w:br/>
-        <w:t>Instituição: Igor Fillipe Brandão Machado</w:t>
+        <w:t>Instituição: UNIALFA</w:t>
         <w:br/>
         <w:t>Linguagem: Python 3</w:t>
       </w:r>

</xml_diff>